<commit_message>
docs(qs): publish defect links and validate contribution against group main
</commit_message>
<xml_diff>
--- a/entrega1/paulo/Relatorio-Paulo-Entrega1.docx
+++ b/entrega1/paulo/Relatorio-Paulo-Entrega1.docx
@@ -22,7 +22,7 @@
     </w:p>
     <w:p>
       <w:r>
-        <w:t>Este relatório reúne a contribuição de Paulo à primeira entrega do Picsou Finance: seleção da classe, testes próprios, execução pela interface e problemas encontrados. Foram aprovados 31 testes unitários da classe e 15 passos de três casos pela interface; dois defeitos adicionais foram confirmados. A publicação no fork e a consolidação pelo grupo permanecem pendentes.</w:t>
+        <w:t>Este relatório reúne a contribuição de Paulo à primeira entrega do Picsou Finance: seleção da classe, testes próprios, execução pela interface e problemas encontrados. Foram aprovados 31 testes unitários da classe e 15 passos de três casos pela interface; dois defeitos adicionais foram confirmados. A branch está publicada no fork; revisão, merge na main e consolidação do grupo permanecem pendentes.</w:t>
       </w:r>
     </w:p>
     <w:p>
@@ -53,7 +53,7 @@
     </w:p>
     <w:p>
       <w:r>
-        <w:t>Fork do grupo: github.com/mssvivian/picsou-finance-QS_2026.2. Branch local: feature/paulo-entrega1-amortizacao. Os commits locais ainda precisam ser publicados; as hashes abaixo distinguem a base do fork do build executado.</w:t>
+        <w:t>Fork do grupo: github.com/mssvivian/picsou-finance-QS_2026.2. Branch publicada: feat/teste_LoanAmortizationService_paulo. As hashes distinguem a base original do fork, o build executado e a integração da main.</w:t>
       </w:r>
     </w:p>
     <w:p>
@@ -67,12 +67,14 @@
         </w:rPr>
         <w:t>Base do fork   6b020c76cf093b8995a68df12a32e8c5b21e9144</w:t>
         <w:br/>
-        <w:t>Build local    58c71b93544c27ff6f9b032dfe2c4df69fe01aa0</w:t>
+        <w:t>Build testado  58c71b93544c27ff6f9b032dfe2c4df69fe01aa0</w:t>
+        <w:br/>
+        <w:t>Integração     4d7a2d362cc12bd24e0d6352beceaac7fc0ec6c6</w:t>
       </w:r>
     </w:p>
     <w:p>
       <w:r>
-        <w:t>Código de produção sem alterações entre essas versões. Aplicação construída localmente, backend real e demo desativado, em localhost:8082. Imagem picsou-paulo:entrega1-58c71b9-lf; adaptação operacional de CRLF para LF no entrypoint. Testes pela interface em 11/10/2026: Windows, Codex In-app Browser, versão não exposta, idioma francês.</w:t>
+        <w:t>Código de empréstimos preservado; a main inclui ajuste do upload Finary, fora deste escopo. Aplicação construída localmente, backend real e demo desativado, em localhost:8082. Imagem picsou-paulo:entrega1-58c71b9-lf; adaptação operacional de CRLF para LF no entrypoint. Testes pela interface em 11/10/2026: Windows, Codex In-app Browser, versão não exposta, idioma francês.</w:t>
       </w:r>
     </w:p>
     <w:p>
@@ -371,7 +373,7 @@
               <w:rPr>
                 <w:sz w:val="20"/>
               </w:rPr>
-              <w:t>Suíte completa do backend</w:t>
+              <w:t>Suíte atual após integração</w:t>
             </w:r>
           </w:p>
         </w:tc>
@@ -395,7 +397,7 @@
               <w:rPr>
                 <w:sz w:val="20"/>
               </w:rPr>
-              <w:t>1271 casos: 1216 aprovados, 20 erros e 35 ignorados</w:t>
+              <w:t>33 casos: 31 aprovados, zero erros e 2 ignorados</w:t>
             </w:r>
           </w:p>
         </w:tc>
@@ -408,7 +410,7 @@
     </w:p>
     <w:p>
       <w:r>
-        <w:t>Os 20 erros de infraestrutura também ocorreram no código original e não foram atribuídos à classe de empréstimos. Dos 35 ignorados, 33 já existiam; dois são as reproduções de defeitos, desativadas na execução padrão. A suíte ampla não foi aprovada globalmente.</w:t>
+        <w:t>A main removeu os testes originais do backend. A suíte atual contém somente os dois arquivos de amortização; as duas reproduções são ignoradas por padrão. Os resultados anteriores de 1271 casos, 20 erros e 35 ignorados são históricos, associados à versão anterior. Os defeitos persistem na integração.</w:t>
       </w:r>
     </w:p>
     <w:p>
@@ -1062,7 +1064,11 @@
     </w:p>
     <w:p>
       <w:r>
-        <w:t>Os relatos completos estão prontos, mas ainda precisam ser publicados no GitHub Issues do fork. Os identificadores BUG-PCV são locais. A entrega 1 exige registro em um bug tracker; arquivos locais e casos no TestLink não substituem essa publicação. Nenhuma regra de negócio foi corrigida nesta contribuição.</w:t>
+        <w:t>Relatos publicados e abertos: BUG-PCV-01 corresponde à issue #4; BUG-PCV-02, à issue #5, ambas atribuídas a PaulcVaz. A produção não foi corrigida nesta contribuição.</w:t>
+        <w:br/>
+        <w:t>https://github.com/mssvivian/picsou-finance-QS_2026.2/issues/4</w:t>
+        <w:br/>
+        <w:t>https://github.com/mssvivian/picsou-finance-QS_2026.2/issues/5</w:t>
       </w:r>
     </w:p>
     <w:p>
@@ -1126,7 +1132,7 @@
     </w:p>
     <w:p>
       <w:r>
-        <w:t>Após receber acesso: publicar a branch preservando autoria; abrir PR; cadastrar as duas issues com evidências; integrar artefatos na main e conferir os links do README. Consolidar o Plano IEEE 829 no Google Docs com o grupo e verificar a submissão no Moodle até 11/10/2026 às 23h59, Brasília.</w:t>
+        <w:t>Branch publicada, autoria preservada e issues #4/#5 registradas. O PR será encaminhado à revisão do grupo, sem merge automático. Após aceite, integrar na main e conferir os links. Consolidar o Plano IEEE 829 no Google Docs e verificar a submissão no Moodle até 11/10/2026 às 23h59, Brasília.</w:t>
       </w:r>
     </w:p>
     <w:p>

</xml_diff>